<commit_message>
Polonia v2: fuentes de la autora (TVP World, Notes from Poland), Dudek sin comillas y aviso sobre la entrevista de Waluś
Co-Authored-By: Claude Sonnet 5.5 <noreply@anthropic.com>
Claude-Session: https://claude.ai/code/session_0151r9ktgqzNpfRKEa5PjGaD
</commit_message>
<xml_diff>
--- a/polonia_walus_v2_corregido.docx
+++ b/polonia_walus_v2_corregido.docx
@@ -580,12 +580,19 @@
         <w:commentReference w:id="24"/>
       </w:r>
       <w:r>
-        <w:t xml:space="preserve"> «</w:t>
+        <w:t xml:space="preserve"> </w:t>
       </w:r>
       <w:commentRangeStart w:id="25"/>
-      <w:r>
-        <w:t xml:space="preserve">la quinta columna de Putin</w:t>
-      </w:r>
+      <w:del w:id="139" w:author="Revisión Internacional" w:date="2026-10-23T09:00:00Z">
+        <w:r>
+          <w:delText xml:space="preserve">«la quinta columna de Putin»</w:delText>
+        </w:r>
+      </w:del>
+      <w:ins w:id="140" w:author="Revisión Internacional" w:date="2026-10-23T09:00:00Z">
+        <w:r>
+          <w:t xml:space="preserve">la quinta columna de Putin</w:t>
+        </w:r>
+      </w:ins>
       <w:commentRangeEnd w:id="25"/>
       <w:r>
         <w:rPr>
@@ -594,17 +601,17 @@
         <w:commentReference w:id="25"/>
       </w:r>
       <w:r>
-        <w:t xml:space="preserve">» en Polonia.</w:t>
+        <w:t xml:space="preserve"> en Polonia.</w:t>
       </w:r>
     </w:p>
     <w:p>
       <w:commentRangeStart w:id="26"/>
-      <w:del w:id="139" w:author="Revisión Internacional" w:date="2026-10-23T09:00:00Z">
+      <w:del w:id="141" w:author="Revisión Internacional" w:date="2026-10-23T09:00:00Z">
         <w:r>
           <w:delText xml:space="preserve">La acusación pesa más en</w:delText>
         </w:r>
       </w:del>
-      <w:ins w:id="140" w:author="Revisión Internacional" w:date="2026-10-23T09:00:00Z">
+      <w:ins w:id="142" w:author="Revisión Internacional" w:date="2026-10-23T09:00:00Z">
         <w:r>
           <w:t xml:space="preserve">Esa acusación llega en</w:t>
         </w:r>
@@ -620,12 +627,12 @@
         <w:t xml:space="preserve"> una campaña que gira en torno a Rusia. </w:t>
       </w:r>
       <w:commentRangeStart w:id="27"/>
-      <w:del w:id="141" w:author="Revisión Internacional" w:date="2026-10-23T09:00:00Z">
+      <w:del w:id="143" w:author="Revisión Internacional" w:date="2026-10-23T09:00:00Z">
         <w:r>
           <w:delText xml:space="preserve">La carrera arrancó</w:delText>
         </w:r>
       </w:del>
-      <w:ins w:id="142" w:author="Revisión Internacional" w:date="2026-10-23T09:00:00Z">
+      <w:ins w:id="144" w:author="Revisión Internacional" w:date="2026-10-23T09:00:00Z">
         <w:r>
           <w:t xml:space="preserve">La campaña arrancó</w:t>
         </w:r>
@@ -641,12 +648,12 @@
         <w:t xml:space="preserve"> extraoficialmente el 1 de septiembre en Westerplatte, donde empezó en 1939 la Segunda Guerra Mundial. Tusk advirtió allí de que el otoño y el invierno pueden ser decisivos para Ucrania y Polonia</w:t>
       </w:r>
       <w:commentRangeStart w:id="28"/>
-      <w:del w:id="143" w:author="Revisión Internacional" w:date="2026-10-23T09:00:00Z">
+      <w:del w:id="145" w:author="Revisión Internacional" w:date="2026-10-23T09:00:00Z">
         <w:r>
           <w:delText xml:space="preserve">: «</w:delText>
         </w:r>
       </w:del>
-      <w:ins w:id="144" w:author="Revisión Internacional" w:date="2026-10-23T09:00:00Z">
+      <w:ins w:id="146" w:author="Revisión Internacional" w:date="2026-10-23T09:00:00Z">
         <w:r>
           <w:t xml:space="preserve">. «</w:t>
         </w:r>
@@ -670,14 +677,14 @@
         <w:commentReference w:id="29"/>
       </w:r>
       <w:commentRangeStart w:id="30"/>
-      <w:del w:id="145" w:author="Revisión Internacional" w:date="2026-10-23T09:00:00Z">
+      <w:del w:id="147" w:author="Revisión Internacional" w:date="2026-10-23T09:00:00Z">
         <w:r>
           <w:delText xml:space="preserve">». En agosto se incendió</w:delText>
         </w:r>
       </w:del>
-      <w:ins w:id="146" w:author="Revisión Internacional" w:date="2026-10-23T09:00:00Z">
-        <w:r>
-          <w:t xml:space="preserve">», añadió. Además, en agosto se incendió</w:t>
+      <w:ins w:id="148" w:author="Revisión Internacional" w:date="2026-10-23T09:00:00Z">
+        <w:r>
+          <w:t xml:space="preserve">», añadió, según el canal público TVP World. Además, en agosto se incendió</w:t>
         </w:r>
       </w:ins>
       <w:commentRangeEnd w:id="30"/>
@@ -691,14 +698,20 @@
         <w:t xml:space="preserve"> una fábrica de componentes de drones </w:t>
       </w:r>
       <w:commentRangeStart w:id="31"/>
-      <w:del w:id="147" w:author="Revisión Internacional" w:date="2026-10-23T09:00:00Z">
+      <w:del w:id="149" w:author="Revisión Internacional" w:date="2026-10-23T09:00:00Z">
         <w:r>
           <w:delText xml:space="preserve">cerca de Varsovia, y se investiga si fue un sabotaje</w:delText>
         </w:r>
       </w:del>
-      <w:ins w:id="148" w:author="Revisión Internacional" w:date="2026-10-23T09:00:00Z">
-        <w:r>
-          <w:t xml:space="preserve">en Skarżysko-Kamienna, al sur de Varsovia. Se investiga si fue un sabotaje</w:t>
+      <w:ins w:id="150" w:author="Revisión Internacional" w:date="2026-10-23T09:00:00Z">
+        <w:r>
+          <w:t xml:space="preserve">en Skarżysko-Kamienna, al sur de Varsovia. Se investiga si fue un sabotaje, según </w:t>
+        </w:r>
+        <w:r>
+          <w:rPr>
+            <w:i/>
+          </w:rPr>
+          <w:t xml:space="preserve">Notes from Poland</w:t>
         </w:r>
       </w:ins>
       <w:commentRangeEnd w:id="31"/>
@@ -709,9 +722,11 @@
         <w:commentReference w:id="31"/>
       </w:r>
       <w:commentRangeStart w:id="32"/>
-      <w:r>
-        <w:t xml:space="preserve"> [FUENTE?]</w:t>
-      </w:r>
+      <w:del w:id="151" w:author="Revisión Internacional" w:date="2026-10-23T09:00:00Z">
+        <w:r>
+          <w:delText xml:space="preserve"> [FUENTE?]</w:delText>
+        </w:r>
+      </w:del>
       <w:commentRangeEnd w:id="32"/>
       <w:r>
         <w:rPr>
@@ -723,12 +738,12 @@
         <w:t xml:space="preserve">. El proyecto de presupuesto para 2027 destina a Defensa 198.100 millones de zlotys, </w:t>
       </w:r>
       <w:commentRangeStart w:id="33"/>
-      <w:del w:id="149" w:author="Revisión Internacional" w:date="2026-10-23T09:00:00Z">
+      <w:del w:id="152" w:author="Revisión Internacional" w:date="2026-10-23T09:00:00Z">
         <w:r>
           <w:delText xml:space="preserve">el 4,5 %</w:delText>
         </w:r>
       </w:del>
-      <w:ins w:id="150" w:author="Revisión Internacional" w:date="2026-10-23T09:00:00Z">
+      <w:ins w:id="153" w:author="Revisión Internacional" w:date="2026-10-23T09:00:00Z">
         <w:r>
           <w:t xml:space="preserve">más del 4,5%</w:t>
         </w:r>
@@ -771,12 +786,12 @@
         <w:t xml:space="preserve">Braun se alimenta también de </w:t>
       </w:r>
       <w:commentRangeStart w:id="35"/>
-      <w:del w:id="151" w:author="Revisión Internacional" w:date="2026-10-23T09:00:00Z">
+      <w:del w:id="154" w:author="Revisión Internacional" w:date="2026-10-23T09:00:00Z">
         <w:r>
           <w:delText xml:space="preserve">otro malestar: los refugiados</w:delText>
         </w:r>
       </w:del>
-      <w:ins w:id="152" w:author="Revisión Internacional" w:date="2026-10-23T09:00:00Z">
+      <w:ins w:id="155" w:author="Revisión Internacional" w:date="2026-10-23T09:00:00Z">
         <w:r>
           <w:t xml:space="preserve">otro malestar, el de los refugiados</w:t>
         </w:r>
@@ -806,12 +821,12 @@
         <w:t xml:space="preserve"> protección temporal en julio, según datos del Gobierno recogidos por </w:t>
       </w:r>
       <w:commentRangeStart w:id="37"/>
-      <w:del w:id="153" w:author="Revisión Internacional" w:date="2026-10-23T09:00:00Z">
+      <w:del w:id="156" w:author="Revisión Internacional" w:date="2026-10-23T09:00:00Z">
         <w:r>
           <w:delText xml:space="preserve">Radio Free Europe, y un sondeo del CBOS</w:delText>
         </w:r>
       </w:del>
-      <w:ins w:id="154" w:author="Revisión Internacional" w:date="2026-10-23T09:00:00Z">
+      <w:ins w:id="157" w:author="Revisión Internacional" w:date="2026-10-23T09:00:00Z">
         <w:r>
           <w:t xml:space="preserve">Radio Free Europe. Asimismo, un sondeo del instituto demoscópico CBOS</w:t>
         </w:r>
@@ -827,12 +842,12 @@
         <w:t xml:space="preserve"> de ese mes halló que el </w:t>
       </w:r>
       <w:commentRangeStart w:id="38"/>
-      <w:del w:id="155" w:author="Revisión Internacional" w:date="2026-10-23T09:00:00Z">
+      <w:del w:id="158" w:author="Revisión Internacional" w:date="2026-10-23T09:00:00Z">
         <w:r>
           <w:delText xml:space="preserve">52 %</w:delText>
         </w:r>
       </w:del>
-      <w:ins w:id="156" w:author="Revisión Internacional" w:date="2026-10-23T09:00:00Z">
+      <w:ins w:id="159" w:author="Revisión Internacional" w:date="2026-10-23T09:00:00Z">
         <w:r>
           <w:t xml:space="preserve">52%</w:t>
         </w:r>
@@ -848,12 +863,12 @@
         <w:t xml:space="preserve"> de los polacos rechaza acogerlos. «La compasión por los ucranianos se ha convertido en desprecio», </w:t>
       </w:r>
       <w:commentRangeStart w:id="39"/>
-      <w:del w:id="157" w:author="Revisión Internacional" w:date="2026-10-23T09:00:00Z">
+      <w:del w:id="160" w:author="Revisión Internacional" w:date="2026-10-23T09:00:00Z">
         <w:r>
           <w:delText xml:space="preserve">sostiene en The Guardian el periodista Mateusz Mazzini</w:delText>
         </w:r>
       </w:del>
-      <w:ins w:id="158" w:author="Revisión Internacional" w:date="2026-10-23T09:00:00Z">
+      <w:ins w:id="161" w:author="Revisión Internacional" w:date="2026-10-23T09:00:00Z">
         <w:r>
           <w:t xml:space="preserve">titula </w:t>
         </w:r>
@@ -897,12 +912,12 @@
         <w:t xml:space="preserve"> </w:t>
       </w:r>
       <w:commentRangeStart w:id="41"/>
-      <w:del w:id="159" w:author="Revisión Internacional" w:date="2026-10-23T09:00:00Z">
+      <w:del w:id="162" w:author="Revisión Internacional" w:date="2026-10-23T09:00:00Z">
         <w:r>
           <w:delText xml:space="preserve">las ayudas, y el Parlamento</w:delText>
         </w:r>
       </w:del>
-      <w:ins w:id="160" w:author="Revisión Internacional" w:date="2026-10-23T09:00:00Z">
+      <w:ins w:id="163" w:author="Revisión Internacional" w:date="2026-10-23T09:00:00Z">
         <w:r>
           <w:t xml:space="preserve">las ayudas. Por otro lado, el Parlamento</w:t>
         </w:r>
@@ -918,12 +933,12 @@
         <w:t xml:space="preserve"> limitó el subsidio por hijo a quienes trabajan. Braun presenta a los refugiados como una amenaza </w:t>
       </w:r>
       <w:commentRangeStart w:id="42"/>
-      <w:del w:id="161" w:author="Revisión Internacional" w:date="2026-10-23T09:00:00Z">
+      <w:del w:id="164" w:author="Revisión Internacional" w:date="2026-10-23T09:00:00Z">
         <w:r>
           <w:delText xml:space="preserve">y alimenta la teoría</w:delText>
         </w:r>
       </w:del>
-      <w:ins w:id="162" w:author="Revisión Internacional" w:date="2026-10-23T09:00:00Z">
+      <w:ins w:id="165" w:author="Revisión Internacional" w:date="2026-10-23T09:00:00Z">
         <w:r>
           <w:t xml:space="preserve">y difunde la teoría</w:t>
         </w:r>
@@ -960,7 +975,7 @@
         <w:t xml:space="preserve">Tusk gobierna desde 2023 en cohabitación con Nawrocki, elegido presidente en 2025 con el apoyo de PiS. En Polonia el primer ministro dirige el Gobierno, pero el presidente puede frenar sus leyes. </w:t>
       </w:r>
       <w:commentRangeStart w:id="44"/>
-      <w:del w:id="163" w:author="Revisión Internacional" w:date="2026-10-23T09:00:00Z">
+      <w:del w:id="166" w:author="Revisión Internacional" w:date="2026-10-23T09:00:00Z">
         <w:r>
           <w:delText xml:space="preserve">Tusk gobierna desde 2023 con mayoría en el Parlamento. Sin embargo, Nawrocki, elegido presidente con el apoyo de PiS, puede vetarlas. </w:delText>
         </w:r>
@@ -973,12 +988,12 @@
         <w:commentReference w:id="44"/>
       </w:r>
       <w:commentRangeStart w:id="45"/>
-      <w:del w:id="164" w:author="Revisión Internacional" w:date="2026-10-23T09:00:00Z">
+      <w:del w:id="167" w:author="Revisión Internacional" w:date="2026-10-23T09:00:00Z">
         <w:r>
           <w:delText xml:space="preserve">El presidente ha usado su poder sobre 37 leyes</w:delText>
         </w:r>
       </w:del>
-      <w:ins w:id="165" w:author="Revisión Internacional" w:date="2026-10-23T09:00:00Z">
+      <w:ins w:id="168" w:author="Revisión Internacional" w:date="2026-10-23T09:00:00Z">
         <w:r>
           <w:t xml:space="preserve">Nawrocki ha vetado más de 40 leyes</w:t>
         </w:r>
@@ -994,7 +1009,7 @@
         <w:t xml:space="preserve">, más que ninguno de sus predecesores, </w:t>
       </w:r>
       <w:commentRangeStart w:id="46"/>
-      <w:del w:id="166" w:author="Revisión Internacional" w:date="2026-10-23T09:00:00Z">
+      <w:del w:id="169" w:author="Revisión Internacional" w:date="2026-10-23T09:00:00Z">
         <w:r>
           <w:delText xml:space="preserve">según </w:delText>
         </w:r>
@@ -1008,7 +1023,7 @@
           <w:delText xml:space="preserve">, y el Gobierno lo apoda</w:delText>
         </w:r>
       </w:del>
-      <w:ins w:id="167" w:author="Revisión Internacional" w:date="2026-10-23T09:00:00Z">
+      <w:ins w:id="170" w:author="Revisión Internacional" w:date="2026-10-23T09:00:00Z">
         <w:r>
           <w:t xml:space="preserve">según el portal </w:t>
         </w:r>
@@ -1044,19 +1059,17 @@
         <w:commentReference w:id="47"/>
       </w:r>
       <w:r>
-        <w:t xml:space="preserve">. Tras cuatro años, Tusk necesitará una nueva razón para que los votantes decepcionados voten», </w:t>
+        <w:t xml:space="preserve">. Tras cuatro años, Tusk necesitará una nueva razón para que los votantes decepcionados voten», señala TVP World.</w:t>
+      </w:r>
+    </w:p>
+    <w:p>
+      <w:r>
+        <w:t xml:space="preserve">La oposición tampoco es un bloque. PiS se rompió en julio, cuando el ex primer ministro Mateusz Morawiecki se marchó con </w:t>
       </w:r>
       <w:commentRangeStart w:id="48"/>
-      <w:del w:id="168" w:author="Revisión Internacional" w:date="2026-10-23T09:00:00Z">
-        <w:r>
-          <w:delText xml:space="preserve">señala TVP World</w:delText>
-        </w:r>
-      </w:del>
-      <w:ins w:id="169" w:author="Revisión Internacional" w:date="2026-10-23T09:00:00Z">
-        <w:r>
-          <w:t xml:space="preserve">señala el canal público TVP World</w:t>
-        </w:r>
-      </w:ins>
+      <w:r>
+        <w:t xml:space="preserve">unos 40 diputados</w:t>
+      </w:r>
       <w:commentRangeEnd w:id="48"/>
       <w:r>
         <w:rPr>
@@ -1065,52 +1078,59 @@
         <w:commentReference w:id="48"/>
       </w:r>
       <w:r>
+        <w:t xml:space="preserve"> y fundó Development Plus. </w:t>
+      </w:r>
+      <w:commentRangeStart w:id="49"/>
+      <w:del w:id="171" w:author="Revisión Internacional" w:date="2026-10-23T09:00:00Z">
+        <w:r>
+          <w:delText xml:space="preserve">KKP ronda el 11% y disputa</w:delText>
+        </w:r>
+      </w:del>
+      <w:ins w:id="172" w:author="Revisión Internacional" w:date="2026-10-23T09:00:00Z">
+        <w:r>
+          <w:t xml:space="preserve">KKP disputa</w:t>
+        </w:r>
+      </w:ins>
+      <w:commentRangeEnd w:id="49"/>
+      <w:r>
+        <w:rPr>
+          <w:rStyle w:val="CommentReference"/>
+        </w:rPr>
+        <w:commentReference w:id="49"/>
+      </w:r>
+      <w:r>
+        <w:t xml:space="preserve"> el voto radical </w:t>
+      </w:r>
+      <w:commentRangeStart w:id="50"/>
+      <w:r>
+        <w:t xml:space="preserve">a la Confederación, otra fuerza de derecha</w:t>
+      </w:r>
+      <w:commentRangeEnd w:id="50"/>
+      <w:r>
+        <w:rPr>
+          <w:rStyle w:val="CommentReference"/>
+        </w:rPr>
+        <w:commentReference w:id="50"/>
+      </w:r>
+      <w:r>
         <w:t xml:space="preserve">.</w:t>
       </w:r>
     </w:p>
     <w:p>
       <w:r>
-        <w:t xml:space="preserve">La oposición tampoco es un bloque. PiS se rompió en julio, cuando el ex primer ministro Mateusz Morawiecki se marchó con </w:t>
-      </w:r>
-      <w:commentRangeStart w:id="49"/>
-      <w:r>
-        <w:t xml:space="preserve">unos 40 diputados</w:t>
-      </w:r>
-      <w:commentRangeEnd w:id="49"/>
-      <w:r>
-        <w:rPr>
-          <w:rStyle w:val="CommentReference"/>
-        </w:rPr>
-        <w:commentReference w:id="49"/>
-      </w:r>
-      <w:r>
-        <w:t xml:space="preserve"> y fundó Development Plus. </w:t>
-      </w:r>
-      <w:commentRangeStart w:id="50"/>
-      <w:del w:id="170" w:author="Revisión Internacional" w:date="2026-10-23T09:00:00Z">
-        <w:r>
-          <w:delText xml:space="preserve">KKP ronda el 11% y disputa</w:delText>
-        </w:r>
-      </w:del>
-      <w:ins w:id="171" w:author="Revisión Internacional" w:date="2026-10-23T09:00:00Z">
-        <w:r>
-          <w:t xml:space="preserve">KKP disputa</w:t>
-        </w:r>
-      </w:ins>
-      <w:commentRangeEnd w:id="50"/>
-      <w:r>
-        <w:rPr>
-          <w:rStyle w:val="CommentReference"/>
-        </w:rPr>
-        <w:commentReference w:id="50"/>
-      </w:r>
-      <w:r>
-        <w:t xml:space="preserve"> el voto radical </w:t>
+        <w:t xml:space="preserve">Jarosław Kaczyński, líder de PiS, dice que </w:t>
       </w:r>
       <w:commentRangeStart w:id="51"/>
-      <w:r>
-        <w:t xml:space="preserve">a la Confederación, otra fuerza de derecha</w:t>
-      </w:r>
+      <w:del w:id="173" w:author="Revisión Internacional" w:date="2026-10-23T09:00:00Z">
+        <w:r>
+          <w:delText xml:space="preserve">no gobernará con Braun</w:delText>
+        </w:r>
+      </w:del>
+      <w:ins w:id="174" w:author="Revisión Internacional" w:date="2026-10-23T09:00:00Z">
+        <w:r>
+          <w:t xml:space="preserve">no cooperará con Braun</w:t>
+        </w:r>
+      </w:ins>
       <w:commentRangeEnd w:id="51"/>
       <w:r>
         <w:rPr>
@@ -1119,24 +1139,12 @@
         <w:commentReference w:id="51"/>
       </w:r>
       <w:r>
-        <w:t xml:space="preserve">.</w:t>
-      </w:r>
-    </w:p>
-    <w:p>
-      <w:r>
-        <w:t xml:space="preserve">Jarosław Kaczyński, líder de PiS, dice que </w:t>
+        <w:t xml:space="preserve">, al que llama «muy peligroso». Pero, si KKP mantiene su apoyo, </w:t>
       </w:r>
       <w:commentRangeStart w:id="52"/>
-      <w:del w:id="172" w:author="Revisión Internacional" w:date="2026-10-23T09:00:00Z">
-        <w:r>
-          <w:delText xml:space="preserve">no gobernará con Braun</w:delText>
-        </w:r>
-      </w:del>
-      <w:ins w:id="173" w:author="Revisión Internacional" w:date="2026-10-23T09:00:00Z">
-        <w:r>
-          <w:t xml:space="preserve">no cooperará con Braun</w:t>
-        </w:r>
-      </w:ins>
+      <w:r>
+        <w:t xml:space="preserve">la oposición apenas podrá sumar mayoría</w:t>
+      </w:r>
       <w:commentRangeEnd w:id="52"/>
       <w:r>
         <w:rPr>
@@ -1145,12 +1153,19 @@
         <w:commentReference w:id="52"/>
       </w:r>
       <w:r>
-        <w:t xml:space="preserve">, al que llama «muy peligroso». Pero, si KKP mantiene su apoyo, </w:t>
+        <w:t xml:space="preserve"> </w:t>
       </w:r>
       <w:commentRangeStart w:id="53"/>
-      <w:r>
-        <w:t xml:space="preserve">la oposición apenas podrá sumar mayoría</w:t>
-      </w:r>
+      <w:del w:id="175" w:author="Revisión Internacional" w:date="2026-10-23T09:00:00Z">
+        <w:r>
+          <w:delText xml:space="preserve">sin él</w:delText>
+        </w:r>
+      </w:del>
+      <w:ins w:id="176" w:author="Revisión Internacional" w:date="2026-10-23T09:00:00Z">
+        <w:r>
+          <w:t xml:space="preserve">sin ese partido</w:t>
+        </w:r>
+      </w:ins>
       <w:commentRangeEnd w:id="53"/>
       <w:r>
         <w:rPr>
@@ -1159,36 +1174,15 @@
         <w:commentReference w:id="53"/>
       </w:r>
       <w:r>
-        <w:t xml:space="preserve"> </w:t>
+        <w:t xml:space="preserve">. Ewa Waluś teme ese desenlace. «No quiero que mi hija crezca y viva de adulta en el país del señor Braun. No sería un país para las mujeres, ni para las minorías, ni para quienes valoran la libertad», </w:t>
       </w:r>
       <w:commentRangeStart w:id="54"/>
-      <w:del w:id="174" w:author="Revisión Internacional" w:date="2026-10-23T09:00:00Z">
-        <w:r>
-          <w:delText xml:space="preserve">sin él</w:delText>
-        </w:r>
-      </w:del>
-      <w:ins w:id="175" w:author="Revisión Internacional" w:date="2026-10-23T09:00:00Z">
-        <w:r>
-          <w:t xml:space="preserve">sin ese partido</w:t>
-        </w:r>
-      </w:ins>
-      <w:commentRangeEnd w:id="54"/>
-      <w:r>
-        <w:rPr>
-          <w:rStyle w:val="CommentReference"/>
-        </w:rPr>
-        <w:commentReference w:id="54"/>
-      </w:r>
-      <w:r>
-        <w:t xml:space="preserve">. Ewa Waluś teme ese desenlace. «No quiero que mi hija crezca y viva de adulta en el país del señor Braun. No sería un país para las mujeres, ni para las minorías, ni para quienes valoran la libertad», </w:t>
-      </w:r>
-      <w:commentRangeStart w:id="55"/>
-      <w:del w:id="176" w:author="Revisión Internacional" w:date="2026-10-23T09:00:00Z">
+      <w:del w:id="177" w:author="Revisión Internacional" w:date="2026-10-23T09:00:00Z">
         <w:r>
           <w:delText xml:space="preserve">dijo a Onet</w:delText>
         </w:r>
       </w:del>
-      <w:ins w:id="177" w:author="Revisión Internacional" w:date="2026-10-23T09:00:00Z">
+      <w:ins w:id="178" w:author="Revisión Internacional" w:date="2026-10-23T09:00:00Z">
         <w:r>
           <w:t xml:space="preserve">dijo al portal </w:t>
         </w:r>
@@ -1199,12 +1193,12 @@
           <w:t xml:space="preserve">Onet</w:t>
         </w:r>
       </w:ins>
-      <w:commentRangeEnd w:id="55"/>
-      <w:r>
-        <w:rPr>
-          <w:rStyle w:val="CommentReference"/>
-        </w:rPr>
-        <w:commentReference w:id="55"/>
+      <w:commentRangeEnd w:id="54"/>
+      <w:r>
+        <w:rPr>
+          <w:rStyle w:val="CommentReference"/>
+        </w:rPr>
+        <w:commentReference w:id="54"/>
       </w:r>
       <w:r>
         <w:t xml:space="preserve">.</w:t>
@@ -1424,7 +1418,7 @@
         <w:annotationRef/>
       </w:r>
       <w:r>
-        <w:t xml:space="preserve">[RJ13] Se deja la marca de la autora. GroundUp sitúa la primera entrevista un mes después de su llegada (enero de 2025) y recoge «What I did, I still consider necessary». Por el buscador, podría ser eNCA/eTV (Annika Larsen, 26/1/2025) o Kanał Zero (16/1/2025), pero no se ha confirmado ni cuál fue la primera ni la frase literal. Sugerencia: «en una entrevista en enero de 2025, según GroundUp».</w:t>
+        <w:t xml:space="preserve">[RJ13] Se deja la marca de la autora. La autora indica Kanał Zero como fuente, pero GroundUp y la prensa polaca (Wprost, Press.pl, natemat) sitúan esa entrevista de Krzysztof Stanowski (16/1/2025) como la SEGUNDA: la primera, un mes después de su llegada, fue la de Michał Zichlarz, en la que dijo que, si tuviera que hacerlo de nuevo, "lo prepararía mejor". En GroundUp la frase «What I did, I still consider necessary» se atribuye a la primera. Hay que confirmar en qué entrevista dijo cada frase antes de atribuirla.</w:t>
       </w:r>
     </w:p>
   </w:comment>
@@ -1632,7 +1626,7 @@
         <w:annotationRef/>
       </w:r>
       <w:r>
-        <w:t xml:space="preserve">[RJ26] NO VERIFICABLE. GroundUp solo parafrasea («saying that Braun and the KKP lead Putin's fifth column in Poland») y no menciona WP Wiadomości ni entrecomilla la frase; el verificador no localizó la entrevista. Mientras no se vea el original, convendría no entrecomillar o atribuir «según GroundUp». Se deja, porque la autora puede tener la fuente. Es también el texto del ladillo.</w:t>
+        <w:t xml:space="preserve">[RJ26] Comillas quitadas por decisión de la autora: GroundUp solo parafrasea («saying that Braun and the KKP lead Putin's fifth column in Poland») y no consta una cita literal. La atribución a WP Wiadomosci tampoco consta en GroundUp, que enlaza un vídeo corto: confirmar el medio. Es también el texto del ladillo, que no se toca.</w:t>
       </w:r>
     </w:p>
   </w:comment>
@@ -1696,7 +1690,7 @@
         <w:annotationRef/>
       </w:r>
       <w:r>
-        <w:t xml:space="preserve">[RJ30] NO VERIFICABLE / probablemente no pronunciada en Westerplatte. Está confirmada la fecha (1/9/2026) y que Tusk dijo que «este otoño y este invierno pueden ser cruciales» para Ucrania y Polonia (gov.pl), pero esta frase no aparece en la cobertura del discurso. Lo más cercano: «el destino de Ucrania es también el nuestro en un futuro cercano» (gov.pl, en inglés). Frases parecidas dijo en otras ocasiones. La autora debe confirmar la fuente; no se toca.</w:t>
+        <w:t xml:space="preserve">[RJ30] Fuente aportada por la autora: análisis de TVP World «Poland's duopoly is cracking as the 2027 battle begins». Según el resumen del buscador, TVP World recoge que Tusk dijo que no hay una Polonia segura sin una Ucrania segura, y Ukrinform confirma el discurso del 1/9/2026 en la conmemoración de Gdańsk. No se ha visto una transcripción ni el texto de TVP World, así que la frase se atribuye a TVP World y no se da como literal del discurso.</w:t>
       </w:r>
     </w:p>
   </w:comment>
@@ -1712,7 +1706,7 @@
         <w:annotationRef/>
       </w:r>
       <w:r>
-        <w:t xml:space="preserve">[RJ31] Verbo de atribución tras la cita (sin dos puntos) y conector de adición para enlazar el incendio con la advertencia de Tusk.</w:t>
+        <w:t xml:space="preserve">[RJ31] Verbo de atribución tras la cita (sin dos puntos), atribución a TVP World (fuente de la autora; se presenta aquí el medio) y conector de adición para enlazar el incendio con la advertencia de Tusk.</w:t>
       </w:r>
     </w:p>
   </w:comment>
@@ -1728,7 +1722,7 @@
         <w:annotationRef/>
       </w:r>
       <w:r>
-        <w:t xml:space="preserve">[RJ32] Discordancia con la fuente: el incendio fue el 31/8/2026 en la planta de WB Electronics en Skarżysko-Kamienna, a unos 150 km al sur de Varsovia (Al Jazeera, DroneXL y Notes from Poland del 31/8; el verificador los vio en fragmentos de buscador, no abiertos). Además, se quita la coma antes de «y» entre oraciones.</w:t>
+        <w:t xml:space="preserve">[RJ32] Discordancia con la fuente: el incendio fue el 31/8/2026 en la planta de WB Electronics en Skarżysko-Kamienna, a unos 150 km al sur de Varsovia (Al Jazeera, DroneXL y Notes from Poland del 31/8; vistos en fragmentos de buscador). Se atribuye a Notes from Poland por indicación de la autora, y se quita la coma antes de «y» entre oraciones. Dato posterior: el 2/9 Tusk dijo que no había duda de que fue un incendio provocado y un acto de sabotaje (Al Jazeera, fiscalía y ABW investigan un delito terrorista con posible implicación de inteligencia extranjera); si la autora quiere, la frase puede actualizarse.</w:t>
       </w:r>
     </w:p>
   </w:comment>
@@ -1744,7 +1738,7 @@
         <w:annotationRef/>
       </w:r>
       <w:r>
-        <w:t xml:space="preserve">[RJ33] Se deja la marca de la autora. El verificador localizó la fuente: los fiscales investigan posible implicación de inteligencia extranjera y delito terrorista, y la ABW examina si hubo sabotaje (Al Jazeera, 31/8/2026: aljazeera.com/news/2026/8/31/poland-opens-terror-probe-into-fire-at-drone-factory; Notes from Poland, 31/8/2026). La autora puede sustituir la marca por esa atribución.</w:t>
+        <w:t xml:space="preserve">[RJ33] Marca [FUENTE?] sustituida por la atribución a Notes from Poland, que la autora ha indicado.</w:t>
       </w:r>
     </w:p>
   </w:comment>
@@ -2000,7 +1994,7 @@
         <w:annotationRef/>
       </w:r>
       <w:r>
-        <w:t xml:space="preserve">[RJ49] Raccord: medio sin presentar (TVP World es el canal en inglés de la televisión pública polaca).</w:t>
+        <w:t xml:space="preserve">[RJ51] PARCIAL. Notes from Poland (14/8/2026): PiS expulsó a 38 diputados y 2 senadores; Morawiecki habla de 40 diputados, un senador y tres eurodiputados. «Unos 40» es aproximado; si solo se cuentan diputados, 38 o 39. La escisión en julio y «Development Plus» (29/7) están confirmadas (fragmentos de buscador).</w:t>
       </w:r>
     </w:p>
   </w:comment>
@@ -2016,7 +2010,7 @@
         <w:annotationRef/>
       </w:r>
       <w:r>
-        <w:t xml:space="preserve">[RJ51] PARCIAL. Notes from Poland (14/8/2026): PiS expulsó a 38 diputados y 2 senadores; Morawiecki habla de 40 diputados, un senador y tres eurodiputados. «Unos 40» es aproximado; si solo se cuentan diputados, 38 o 39. La escisión en julio y «Development Plus» (29/7) están confirmadas (fragmentos de buscador).</w:t>
+        <w:t xml:space="preserve">[RJ50] El 11% ya figura en el subtítulo y en el párrafo 5. Evita la tercera repetición y el desajuste «11 %»/«11%» (−4 palabras).</w:t>
       </w:r>
     </w:p>
   </w:comment>
@@ -2032,7 +2026,7 @@
         <w:annotationRef/>
       </w:r>
       <w:r>
-        <w:t xml:space="preserve">[RJ50] El 11% ya figura en el subtítulo y en el párrafo 5. Evita la tercera repetición y el desajuste «11 %»/«11%» (−4 palabras).</w:t>
+        <w:t xml:space="preserve">[RJ52] Raccord: «la Confederación» se parece al nombre completo de KKP (Confederación de la Corona Polaca) y puede confundirse con ella. La autora debería dar el nombre de esa otra formación.</w:t>
       </w:r>
     </w:p>
   </w:comment>
@@ -2048,7 +2042,7 @@
         <w:annotationRef/>
       </w:r>
       <w:r>
-        <w:t xml:space="preserve">[RJ52] Raccord: «la Confederación» se parece al nombre completo de KKP (Confederación de la Corona Polaca) y puede confundirse con ella. La autora debería dar el nombre de esa otra formación.</w:t>
+        <w:t xml:space="preserve">[RJ53] GroundUp: Kaczyński «will not cooperate with Braun, whom he has called “very dangerous”». «Cooperar» no es «gobernar». La cita «muy peligroso» es fiel.</w:t>
       </w:r>
     </w:p>
   </w:comment>
@@ -2064,7 +2058,7 @@
         <w:annotationRef/>
       </w:r>
       <w:r>
-        <w:t xml:space="preserve">[RJ53] GroundUp: Kaczyński «will not cooperate with Braun, whom he has called “very dangerous”». «Cooperar» no es «gobernar». La cita «muy peligroso» es fiel.</w:t>
+        <w:t xml:space="preserve">[RJ54] Predicción sin atribuir. Convendría atribuirla a un analista o a una fuente, o plantearla como hecho (p. ej., número de escaños). No se toca.</w:t>
       </w:r>
     </w:p>
   </w:comment>
@@ -2080,27 +2074,11 @@
         <w:annotationRef/>
       </w:r>
       <w:r>
-        <w:t xml:space="preserve">[RJ54] Predicción sin atribuir. Convendría atribuirla a un analista o a una fuente, o plantearla como hecho (p. ej., número de escaños). No se toca.</w:t>
+        <w:t xml:space="preserve">[RJ55] «Él» podía ser Braun, Kaczyński o KKP; se explicita que es el partido.</w:t>
       </w:r>
     </w:p>
   </w:comment>
   <w:comment w:id="54" w:author="Revisión Internacional" w:date="2026-10-23T09:00:00Z" w:initials="RI">
-    <w:p>
-      <w:pPr>
-        <w:pStyle w:val="CommentText"/>
-      </w:pPr>
-      <w:r>
-        <w:rPr>
-          <w:rStyle w:val="CommentReference"/>
-        </w:rPr>
-        <w:annotationRef/>
-      </w:r>
-      <w:r>
-        <w:t xml:space="preserve">[RJ55] «Él» podía ser Braun, Kaczyński o KKP; se explicita que es el partido.</w:t>
-      </w:r>
-    </w:p>
-  </w:comment>
-  <w:comment w:id="55" w:author="Revisión Internacional" w:date="2026-10-23T09:00:00Z" w:initials="RI">
     <w:p>
       <w:pPr>
         <w:pStyle w:val="CommentText"/>

</xml_diff>